<commit_message>
Add Patent Examiner role; update resume with recent work history
Homepage: add USPTO Patent Examiner (AU 2611, Computer Graphics) to
Professional Experience.

Resume: add Patent Examiner entry, update St. Mary of the Mills to
Substitute Teacher & Aftercare Instructor (Sept 2024 - June 2025), and
add Fairway Hills Golf Course (Aug-Oct 2025). PDF resume still needs a
manual re-export from the updated docx.

Co-Authored-By: Claude Sonnet 5 <noreply@anthropic.com>
</commit_message>
<xml_diff>
--- a/downloads/jgocoResume.docx
+++ b/downloads/jgocoResume.docx
@@ -214,6 +214,118 @@
           <w:szCs w:val="20"/>
           <w:rtl w:val="0"/>
         </w:rPr>
+        <w:t xml:space="preserve">United States Patent and Trademark Office (USPTO)</w:t>
+      </w:r>
+    </w:p>
+    <w:p>
+      <w:pPr>
+        <w:spacing w:line="240" w:lineRule="auto"/>
+        <w:rPr>
+          <w:sz w:val="20"/>
+          <w:szCs w:val="20"/>
+        </w:rPr>
+      </w:pPr>
+      <w:r>
+        <w:rPr>
+          <w:b w:val="1"/>
+          <w:sz w:val="20"/>
+          <w:szCs w:val="20"/>
+          <w:rtl w:val="0"/>
+        </w:rPr>
+        <w:t xml:space="preserve">Patent Examiner </w:t>
+      </w:r>
+      <w:r>
+        <w:rPr>
+          <w:sz w:val="20"/>
+          <w:szCs w:val="20"/>
+          <w:rtl w:val="0"/>
+        </w:rPr>
+        <w:t xml:space="preserve">(Oct 2025 - Present) | Art Unit 2611, Computer Graphics</w:t>
+      </w:r>
+    </w:p>
+    <w:p>
+      <w:pPr>
+        <w:numPr>
+          <w:ilvl w:val="0"/>
+          <w:numId w:val="3"/>
+        </w:numPr>
+        <w:spacing w:line="240" w:lineRule="auto"/>
+        <w:ind w:left="720" w:hanging="360"/>
+        <w:rPr>
+          <w:sz w:val="20"/>
+          <w:szCs w:val="20"/>
+          <w:u w:val="none"/>
+        </w:rPr>
+      </w:pPr>
+      <w:r>
+        <w:rPr>
+          <w:sz w:val="20"/>
+          <w:szCs w:val="20"/>
+          <w:rtl w:val="0"/>
+        </w:rPr>
+        <w:t xml:space="preserve">Examine patent applications in the computer graphics art area for compliance with USPTO statutes and regulations, including 35 U.S.C. §§ 101, 102, 103, and 112</w:t>
+      </w:r>
+    </w:p>
+    <w:p>
+      <w:pPr>
+        <w:numPr>
+          <w:ilvl w:val="0"/>
+          <w:numId w:val="3"/>
+        </w:numPr>
+        <w:spacing w:line="240" w:lineRule="auto"/>
+        <w:ind w:left="720" w:hanging="360"/>
+        <w:rPr>
+          <w:sz w:val="20"/>
+          <w:szCs w:val="20"/>
+          <w:u w:val="none"/>
+        </w:rPr>
+      </w:pPr>
+      <w:r>
+        <w:rPr>
+          <w:sz w:val="20"/>
+          <w:szCs w:val="20"/>
+          <w:rtl w:val="0"/>
+        </w:rPr>
+        <w:t xml:space="preserve">Conduct prior art searches across U.S. and international patent literature and technical publications to evaluate novelty and non-obviousness of claimed inventions</w:t>
+      </w:r>
+    </w:p>
+    <w:p>
+      <w:pPr>
+        <w:numPr>
+          <w:ilvl w:val="0"/>
+          <w:numId w:val="3"/>
+        </w:numPr>
+        <w:spacing w:line="240" w:lineRule="auto"/>
+        <w:ind w:left="720" w:hanging="360"/>
+        <w:rPr>
+          <w:sz w:val="20"/>
+          <w:szCs w:val="20"/>
+          <w:u w:val="none"/>
+        </w:rPr>
+      </w:pPr>
+      <w:r>
+        <w:rPr>
+          <w:sz w:val="20"/>
+          <w:szCs w:val="20"/>
+          <w:rtl w:val="0"/>
+        </w:rPr>
+        <w:t xml:space="preserve">Draft and issue Office Actions communicating examination findings and legal reasoning to applicants and patent attorneys</w:t>
+      </w:r>
+    </w:p>
+    <w:p>
+      <w:pPr>
+        <w:spacing w:line="240" w:lineRule="auto"/>
+        <w:rPr>
+          <w:sz w:val="20"/>
+          <w:szCs w:val="20"/>
+        </w:rPr>
+      </w:pPr>
+      <w:r>
+        <w:rPr>
+          <w:sz w:val="20"/>
+          <w:szCs w:val="20"/>
+          <w:rtl w:val="0"/>
+        </w:rPr>
         <w:t xml:space="preserve">Maryland Department of IT</w:t>
       </w:r>
     </w:p>
@@ -471,12 +583,37 @@
     </w:p>
     <w:p>
       <w:pPr>
+        <w:spacing w:line="240" w:lineRule="auto"/>
         <w:rPr/>
       </w:pPr>
       <w:r>
         <w:rPr>
           <w:rtl w:val="0"/>
         </w:rPr>
+        <w:t xml:space="preserve">Fairway Hills Golf Course - </w:t>
+      </w:r>
+      <w:r>
+        <w:rPr>
+          <w:b w:val="1"/>
+          <w:rtl w:val="0"/>
+        </w:rPr>
+        <w:t xml:space="preserve">Starter / Cashier / Assistant</w:t>
+      </w:r>
+      <w:r>
+        <w:rPr>
+          <w:rtl w:val="0"/>
+        </w:rPr>
+        <w:t xml:space="preserve"> - Aug 2025 - Oct 2025</w:t>
+      </w:r>
+    </w:p>
+    <w:p>
+      <w:pPr>
+        <w:rPr/>
+      </w:pPr>
+      <w:r>
+        <w:rPr>
+          <w:rtl w:val="0"/>
+        </w:rPr>
         <w:t xml:space="preserve">St. Mary of the Mills School - </w:t>
       </w:r>
       <w:r>
@@ -484,18 +621,13 @@
           <w:b w:val="1"/>
           <w:rtl w:val="0"/>
         </w:rPr>
-        <w:t xml:space="preserve">Substitute Teacher </w:t>
-      </w:r>
-      <w:r>
-        <w:rPr>
-          <w:rtl w:val="0"/>
-        </w:rPr>
-        <w:t xml:space="preserve">- Sept 2024 - Present</w:t>
-      </w:r>
-      <w:r>
-        <w:rPr>
-          <w:rtl w:val="0"/>
-        </w:rPr>
+        <w:t xml:space="preserve">Substitute Teacher &amp; Aftercare Instructor </w:t>
+      </w:r>
+      <w:r>
+        <w:rPr>
+          <w:rtl w:val="0"/>
+        </w:rPr>
+        <w:t xml:space="preserve">- Sept 2024 - June 2025</w:t>
       </w:r>
     </w:p>
     <w:p>
@@ -520,11 +652,6 @@
           <w:rtl w:val="0"/>
         </w:rPr>
         <w:t xml:space="preserve"> - Aug 2022 - Sept 2023</w:t>
-      </w:r>
-      <w:r>
-        <w:rPr>
-          <w:rtl w:val="0"/>
-        </w:rPr>
       </w:r>
     </w:p>
     <w:p>
@@ -1013,11 +1140,124 @@
       </w:rPr>
     </w:lvl>
   </w:abstractNum>
+  <w:abstractNum w:abstractNumId="3">
+    <w:lvl w:ilvl="0">
+      <w:start w:val="1"/>
+      <w:numFmt w:val="bullet"/>
+      <w:lvlText w:val="●"/>
+      <w:lvlJc w:val="left"/>
+      <w:pPr>
+        <w:ind w:left="720" w:hanging="360"/>
+      </w:pPr>
+      <w:rPr>
+        <w:u w:val="none"/>
+      </w:rPr>
+    </w:lvl>
+    <w:lvl w:ilvl="1">
+      <w:start w:val="1"/>
+      <w:numFmt w:val="bullet"/>
+      <w:lvlText w:val="○"/>
+      <w:lvlJc w:val="left"/>
+      <w:pPr>
+        <w:ind w:left="1440" w:hanging="360"/>
+      </w:pPr>
+      <w:rPr>
+        <w:u w:val="none"/>
+      </w:rPr>
+    </w:lvl>
+    <w:lvl w:ilvl="2">
+      <w:start w:val="1"/>
+      <w:numFmt w:val="bullet"/>
+      <w:lvlText w:val="■"/>
+      <w:lvlJc w:val="left"/>
+      <w:pPr>
+        <w:ind w:left="2160" w:hanging="360"/>
+      </w:pPr>
+      <w:rPr>
+        <w:u w:val="none"/>
+      </w:rPr>
+    </w:lvl>
+    <w:lvl w:ilvl="3">
+      <w:start w:val="1"/>
+      <w:numFmt w:val="bullet"/>
+      <w:lvlText w:val="●"/>
+      <w:lvlJc w:val="left"/>
+      <w:pPr>
+        <w:ind w:left="2880" w:hanging="360"/>
+      </w:pPr>
+      <w:rPr>
+        <w:u w:val="none"/>
+      </w:rPr>
+    </w:lvl>
+    <w:lvl w:ilvl="4">
+      <w:start w:val="1"/>
+      <w:numFmt w:val="bullet"/>
+      <w:lvlText w:val="○"/>
+      <w:lvlJc w:val="left"/>
+      <w:pPr>
+        <w:ind w:left="3600" w:hanging="360"/>
+      </w:pPr>
+      <w:rPr>
+        <w:u w:val="none"/>
+      </w:rPr>
+    </w:lvl>
+    <w:lvl w:ilvl="5">
+      <w:start w:val="1"/>
+      <w:numFmt w:val="bullet"/>
+      <w:lvlText w:val="■"/>
+      <w:lvlJc w:val="left"/>
+      <w:pPr>
+        <w:ind w:left="4320" w:hanging="360"/>
+      </w:pPr>
+      <w:rPr>
+        <w:u w:val="none"/>
+      </w:rPr>
+    </w:lvl>
+    <w:lvl w:ilvl="6">
+      <w:start w:val="1"/>
+      <w:numFmt w:val="bullet"/>
+      <w:lvlText w:val="●"/>
+      <w:lvlJc w:val="left"/>
+      <w:pPr>
+        <w:ind w:left="5040" w:hanging="360"/>
+      </w:pPr>
+      <w:rPr>
+        <w:u w:val="none"/>
+      </w:rPr>
+    </w:lvl>
+    <w:lvl w:ilvl="7">
+      <w:start w:val="1"/>
+      <w:numFmt w:val="bullet"/>
+      <w:lvlText w:val="○"/>
+      <w:lvlJc w:val="left"/>
+      <w:pPr>
+        <w:ind w:left="5760" w:hanging="360"/>
+      </w:pPr>
+      <w:rPr>
+        <w:u w:val="none"/>
+      </w:rPr>
+    </w:lvl>
+    <w:lvl w:ilvl="8">
+      <w:start w:val="1"/>
+      <w:numFmt w:val="bullet"/>
+      <w:lvlText w:val="■"/>
+      <w:lvlJc w:val="left"/>
+      <w:pPr>
+        <w:ind w:left="6480" w:hanging="360"/>
+      </w:pPr>
+      <w:rPr>
+        <w:u w:val="none"/>
+      </w:rPr>
+    </w:lvl>
+  </w:abstractNum>
   <w:num w:numId="1">
     <w:abstractNumId w:val="1"/>
   </w:num>
   <w:num w:numId="2">
     <w:abstractNumId w:val="2"/>
+  </w:num>
+  <w:num w:numId="3">
+    <w:abstractNumId w:val="3"/>
   </w:num>
 </w:numbering>
 </file>

</xml_diff>

<commit_message>
Tighten resume spacing/margins to fit one page
Co-Authored-By: Claude Sonnet 5 <noreply@anthropic.com>
</commit_message>
<xml_diff>
--- a/downloads/jgocoResume.docx
+++ b/downloads/jgocoResume.docx
@@ -911,7 +911,7 @@
     </w:p>
     <w:sectPr>
       <w:pgSz w:h="15840" w:w="12240" w:orient="portrait"/>
-      <w:pgMar w:bottom="720" w:top="720" w:left="720" w:right="720" w:header="720" w:footer="720"/>
+      <w:pgMar w:bottom="360" w:top="360" w:left="720" w:right="720" w:header="720" w:footer="720"/>
       <w:pgNumType w:start="1"/>
     </w:sectPr>
   </w:body>
@@ -1275,7 +1275,7 @@
     </w:rPrDefault>
     <w:pPrDefault>
       <w:pPr>
-        <w:spacing w:line="276" w:lineRule="auto"/>
+        <w:spacing w:line="240" w:lineRule="auto"/>
       </w:pPr>
     </w:pPrDefault>
   </w:docDefaults>
@@ -1308,7 +1308,7 @@
       <w:keepNext w:val="1"/>
       <w:keepLines w:val="1"/>
       <w:pageBreakBefore w:val="0"/>
-      <w:spacing w:after="120" w:before="360" w:lineRule="auto"/>
+      <w:spacing w:after="60" w:before="140" w:lineRule="auto"/>
     </w:pPr>
     <w:rPr>
       <w:b w:val="0"/>
@@ -1324,7 +1324,7 @@
       <w:keepNext w:val="1"/>
       <w:keepLines w:val="1"/>
       <w:pageBreakBefore w:val="0"/>
-      <w:spacing w:after="80" w:before="320" w:lineRule="auto"/>
+      <w:spacing w:after="40" w:before="140" w:lineRule="auto"/>
     </w:pPr>
     <w:rPr>
       <w:b w:val="0"/>

</xml_diff>